<commit_message>
fix(lab1): add SRS TBD owners
</commit_message>
<xml_diff>
--- a/docs/lab1/source/计算机23-2_231002208_戚晋瑜_实验一_SRS_v1.0.docx
+++ b/docs/lab1/source/计算机23-2_231002208_戚晋瑜_实验一_SRS_v1.0.docx
@@ -2576,14 +2576,15 @@
         <w:tblLook w:firstColumn="1" w:firstRow="1" w:lastColumn="0" w:lastRow="0" w:noHBand="0" w:noVBand="1" w:val="04A0"/>
       </w:tblPr>
       <w:tblGrid>
-        <w:gridCol w:w="2882"/>
-        <w:gridCol w:w="2882"/>
-        <w:gridCol w:w="2882"/>
+        <w:gridCol w:w="2161"/>
+        <w:gridCol w:w="2161"/>
+        <w:gridCol w:w="2161"/>
+        <w:gridCol w:w="2161"/>
       </w:tblGrid>
       <w:tr>
         <w:tc>
           <w:tcPr>
-            <w:tcW w:type="dxa" w:w="2882"/>
+            <w:tcW w:type="dxa" w:w="2161"/>
           </w:tcPr>
           <w:p>
             <w:r>
@@ -2593,7 +2594,7 @@
         </w:tc>
         <w:tc>
           <w:tcPr>
-            <w:tcW w:type="dxa" w:w="2882"/>
+            <w:tcW w:type="dxa" w:w="2161"/>
           </w:tcPr>
           <w:p>
             <w:r>
@@ -2603,7 +2604,17 @@
         </w:tc>
         <w:tc>
           <w:tcPr>
-            <w:tcW w:type="dxa" w:w="2882"/>
+            <w:tcW w:type="dxa" w:w="2161"/>
+          </w:tcPr>
+          <w:p>
+            <w:r>
+              <w:t>负责人</w:t>
+            </w:r>
+          </w:p>
+        </w:tc>
+        <w:tc>
+          <w:tcPr>
+            <w:tcW w:type="dxa" w:w="2161"/>
           </w:tcPr>
           <w:p>
             <w:r>
@@ -2615,7 +2626,7 @@
       <w:tr>
         <w:tc>
           <w:tcPr>
-            <w:tcW w:type="dxa" w:w="2882"/>
+            <w:tcW w:type="dxa" w:w="2161"/>
           </w:tcPr>
           <w:p>
             <w:r>
@@ -2625,7 +2636,7 @@
         </w:tc>
         <w:tc>
           <w:tcPr>
-            <w:tcW w:type="dxa" w:w="2882"/>
+            <w:tcW w:type="dxa" w:w="2161"/>
           </w:tcPr>
           <w:p>
             <w:r>
@@ -2635,7 +2646,17 @@
         </w:tc>
         <w:tc>
           <w:tcPr>
-            <w:tcW w:type="dxa" w:w="2882"/>
+            <w:tcW w:type="dxa" w:w="2161"/>
+          </w:tcPr>
+          <w:p>
+            <w:r>
+              <w:t>运营总监</w:t>
+            </w:r>
+          </w:p>
+        </w:tc>
+        <w:tc>
+          <w:tcPr>
+            <w:tcW w:type="dxa" w:w="2161"/>
           </w:tcPr>
           <w:p>
             <w:r>
@@ -2647,7 +2668,7 @@
       <w:tr>
         <w:tc>
           <w:tcPr>
-            <w:tcW w:type="dxa" w:w="2882"/>
+            <w:tcW w:type="dxa" w:w="2161"/>
           </w:tcPr>
           <w:p>
             <w:r>
@@ -2657,7 +2678,7 @@
         </w:tc>
         <w:tc>
           <w:tcPr>
-            <w:tcW w:type="dxa" w:w="2882"/>
+            <w:tcW w:type="dxa" w:w="2161"/>
           </w:tcPr>
           <w:p>
             <w:r>
@@ -2667,7 +2688,17 @@
         </w:tc>
         <w:tc>
           <w:tcPr>
-            <w:tcW w:type="dxa" w:w="2882"/>
+            <w:tcW w:type="dxa" w:w="2161"/>
+          </w:tcPr>
+          <w:p>
+            <w:r>
+              <w:t>本人</w:t>
+            </w:r>
+          </w:p>
+        </w:tc>
+        <w:tc>
+          <w:tcPr>
+            <w:tcW w:type="dxa" w:w="2161"/>
           </w:tcPr>
           <w:p>
             <w:r>
@@ -2679,7 +2710,7 @@
       <w:tr>
         <w:tc>
           <w:tcPr>
-            <w:tcW w:type="dxa" w:w="2882"/>
+            <w:tcW w:type="dxa" w:w="2161"/>
           </w:tcPr>
           <w:p>
             <w:r>
@@ -2689,7 +2720,7 @@
         </w:tc>
         <w:tc>
           <w:tcPr>
-            <w:tcW w:type="dxa" w:w="2882"/>
+            <w:tcW w:type="dxa" w:w="2161"/>
           </w:tcPr>
           <w:p>
             <w:r>
@@ -2699,7 +2730,17 @@
         </w:tc>
         <w:tc>
           <w:tcPr>
-            <w:tcW w:type="dxa" w:w="2882"/>
+            <w:tcW w:type="dxa" w:w="2161"/>
+          </w:tcPr>
+          <w:p>
+            <w:r>
+              <w:t>课程组</w:t>
+            </w:r>
+          </w:p>
+        </w:tc>
+        <w:tc>
+          <w:tcPr>
+            <w:tcW w:type="dxa" w:w="2161"/>
           </w:tcPr>
           <w:p>
             <w:r>

</xml_diff>

<commit_message>
fix(lab1): normalize ISO25010 NFR categories
</commit_message>
<xml_diff>
--- a/docs/lab1/source/计算机23-2_231002208_戚晋瑜_实验一_SRS_v1.0.docx
+++ b/docs/lab1/source/计算机23-2_231002208_戚晋瑜_实验一_SRS_v1.0.docx
@@ -1939,7 +1939,7 @@
           </w:tcPr>
           <w:p>
             <w:r>
-              <w:t>可用性</w:t>
+              <w:t>易用性</w:t>
             </w:r>
           </w:p>
         </w:tc>
@@ -2063,7 +2063,7 @@
           </w:tcPr>
           <w:p>
             <w:r>
-              <w:t>可审计性</w:t>
+              <w:t>安全性</w:t>
             </w:r>
           </w:p>
         </w:tc>
@@ -2187,7 +2187,7 @@
           </w:tcPr>
           <w:p>
             <w:r>
-              <w:t>功能适应性</w:t>
+              <w:t>功能适合性</w:t>
             </w:r>
           </w:p>
         </w:tc>

</xml_diff>